<commit_message>
Add official competition spec docs, Rev.5 brief fixes, and Case 1 illustration
Co-authored-by: Cursor <cursoragent@cursor.com>
</commit_message>
<xml_diff>
--- a/docs/AFAC2026_Track1_Project_Brief.docx
+++ b/docs/AFAC2026_Track1_Project_Brief.docx
@@ -64,7 +64,7 @@
           <w:sz w:val="20"/>
           <w:szCs w:val="20"/>
         </w:rPr>
-        <w:t xml:space="preserve">Rev. 4 — daily-ops cadence added; pattern_type confirmed fully open (label freely); example labels are officially RANDOM; feature-fidelity risk dissolved (no canonical fields).</w:t>
+        <w:t xml:space="preserve">Rev. 5 — verification fixes: Case 1 cited to competition spec §7.2 (add spec to repo); §2/§3 contradiction resolved; submit.zip no-nested-folders guard; live-page facts flagged for confirmation.</w:t>
       </w:r>
     </w:p>
     <w:tbl>
@@ -426,7 +426,7 @@
         <w:t xml:space="preserve">weak-supervision problem</w:t>
       </w:r>
       <w:r>
-        <w:t xml:space="preserve">: we must reconstruct the organizer's labelling logic from (a) the feature semantics, (b) the worked Case 1, and (c) the filled example files they shipped. If our definition of “hot money” diverges from theirs, even a perfect classifier scores poorly because it perfectly predicts the wrong target.</w:t>
+        <w:t xml:space="preserve">: we must reconstruct the organizer's labelling logic from (a) the feature semantics, (b) the worked Case 1 (competition spec §7.2 “Shrinking Volume Game” — ensure that spec PDF is in docs/), and (c) the filled example files they shipped. If our definition of “hot money” diverges from theirs, even a perfect classifier scores poorly because it perfectly predicts the wrong target.</w:t>
       </w:r>
     </w:p>
     <w:p>
@@ -708,19 +708,19 @@
                 <w:sz w:val="19"/>
                 <w:szCs w:val="19"/>
               </w:rPr>
-              <w:t xml:space="preserve">Filled worked EXAMPLE for Task 2.</w:t>
-            </w:r>
-          </w:p>
-          <w:p>
-            <w:pPr>
-              <w:spacing w:after="20"/>
-            </w:pPr>
-            <w:r>
-              <w:rPr>
-                <w:sz w:val="19"/>
-                <w:szCs w:val="19"/>
-              </w:rPr>
-              <w:t xml:space="preserve">1,098 rows · 198 stocks · 19 dates (Apr 21–May 22).</w:t>
+              <w:t xml:space="preserve">Filled EXAMPLE for Task 2 — labels are RANDOM (official FAQ).</w:t>
+            </w:r>
+          </w:p>
+          <w:p>
+            <w:pPr>
+              <w:spacing w:after="20"/>
+            </w:pPr>
+            <w:r>
+              <w:rPr>
+                <w:sz w:val="19"/>
+                <w:szCs w:val="19"/>
+              </w:rPr>
+              <w:t xml:space="preserve">1,098 rows · 198 stocks · 19 dates.</w:t>
             </w:r>
           </w:p>
         </w:tc>
@@ -750,19 +750,7 @@
                 <w:sz w:val="19"/>
                 <w:szCs w:val="19"/>
               </w:rPr>
-              <w:t xml:space="preserve">Reverse-engineer exact label strings + class balance.</w:t>
-            </w:r>
-          </w:p>
-          <w:p>
-            <w:pPr>
-              <w:spacing w:after="20"/>
-            </w:pPr>
-            <w:r>
-              <w:rPr>
-                <w:sz w:val="19"/>
-                <w:szCs w:val="19"/>
-              </w:rPr>
-              <w:t xml:space="preserve">Joint-distribution sanity check (see §3).</w:t>
+              <w:t xml:space="preserve">Use for FORMAT ONLY (column names/order, date format, encoding). Read no signal from label values or their distribution (see §3).</w:t>
             </w:r>
           </w:p>
         </w:tc>
@@ -1210,6 +1198,100 @@
         <w:t xml:space="preserve">; both CSVs have exactly 4 columns with unchanged names and order.</w:t>
       </w:r>
     </w:p>
+    <w:tbl>
+      <w:tblPr>
+        <w:tblW w:type="dxa" w:w="9360"/>
+        <w:tblBorders>
+          <w:top w:val="single" w:color="auto" w:sz="4"/>
+          <w:left w:val="single" w:color="auto" w:sz="4"/>
+          <w:bottom w:val="single" w:color="auto" w:sz="4"/>
+          <w:right w:val="single" w:color="auto" w:sz="4"/>
+          <w:insideH w:val="single" w:color="auto" w:sz="4"/>
+          <w:insideV w:val="single" w:color="auto" w:sz="4"/>
+        </w:tblBorders>
+      </w:tblPr>
+      <w:tblGrid>
+        <w:gridCol w:w="9360"/>
+      </w:tblGrid>
+      <w:tr>
+        <w:tc>
+          <w:tcPr>
+            <w:tcW w:type="dxa" w:w="9360"/>
+            <w:tcBorders>
+              <w:top w:val="single" w:color="E0A0A0" w:sz="1"/>
+              <w:left w:val="single" w:color="D04030" w:sz="18"/>
+              <w:bottom w:val="single" w:color="E0A0A0" w:sz="1"/>
+              <w:right w:val="single" w:color="E0A0A0" w:sz="1"/>
+            </w:tcBorders>
+            <w:shd w:fill="FCE8E6" w:val="clear"/>
+            <w:tcMar>
+              <w:top w:type="dxa" w:w="100"/>
+              <w:left w:type="dxa" w:w="160"/>
+              <w:bottom w:type="dxa" w:w="100"/>
+              <w:right w:type="dxa" w:w="160"/>
+            </w:tcMar>
+          </w:tcPr>
+          <w:p>
+            <w:pPr>
+              <w:spacing w:after="60"/>
+            </w:pPr>
+            <w:r>
+              <w:rPr>
+                <w:b/>
+                <w:bCs/>
+                <w:color w:val="1F3A5F"/>
+              </w:rPr>
+              <w:t xml:space="preserve">Sourcing provenance — repo-verified vs live-page facts</w:t>
+            </w:r>
+          </w:p>
+          <w:p>
+            <w:pPr>
+              <w:spacing w:after="40"/>
+            </w:pPr>
+            <w:r>
+              <w:rPr>
+                <w:b/>
+                <w:bCs/>
+              </w:rPr>
+              <w:t xml:space="preserve">Repo-verified (citeable from files): </w:t>
+            </w:r>
+            <w:r>
+              <w:t xml:space="preserve">label sets, data-file schemas, the baseline guide's engineering facts, the random-labels FAQ. These are settled.</w:t>
+            </w:r>
+          </w:p>
+          <w:p>
+            <w:pPr>
+              <w:spacing w:after="40"/>
+            </w:pPr>
+            <w:r>
+              <w:rPr>
+                <w:b/>
+                <w:bCs/>
+              </w:rPr>
+              <w:t xml:space="preserve">Live-page facts — CONFIRM before relying on (not in repo files): </w:t>
+            </w:r>
+            <w:r>
+              <w:t xml:space="preserve">the T+5 / 3-trading-day scoring gloss, 3-submissions/day, the ≥8-B-board-days exclusion rule, the July calendar, and team-size limits. Two of these (≥8 B-board days, submission limits) are DQ-CRITICAL — verify directly on the Tianchi competition page before B-board.</w:t>
+            </w:r>
+          </w:p>
+          <w:p>
+            <w:pPr>
+              <w:spacing w:after="40"/>
+            </w:pPr>
+            <w:r>
+              <w:rPr>
+                <w:b/>
+                <w:bCs/>
+              </w:rPr>
+              <w:t xml:space="preserve">Also add to repo: </w:t>
+            </w:r>
+            <w:r>
+              <w:t xml:space="preserve">the original Track-1 competition spec PDF (contains §7.2 Case 1). It was referenced but is missing from docs/ — a verification grep won't find Case 1 until it's added.</w:t>
+            </w:r>
+          </w:p>
+        </w:tc>
+      </w:tr>
+    </w:tbl>
     <w:p>
       <w:pPr>
         <w:pStyle w:val="Heading1"/>
@@ -2912,10 +2994,10 @@
           <w:b/>
           <w:bCs/>
         </w:rPr>
-        <w:t xml:space="preserve">Anchor against Case 1: </w:t>
-      </w:r>
-      <w:r>
-        <w:t xml:space="preserve">“Shrinking Volume Game” gives signal mappings — CV~24ms → rs_interval_cv (machine/量化); iceberg split → rs_split_similarity; open/close &gt;70% → pi_open/close concentration (游资 rhythm); bid-sweeping → ap_unilateral_intensity. NOTE: the ~70% cancellation signal needs the cancel table (§4.2) — unavailable from snapshots alone.</w:t>
+        <w:t xml:space="preserve">Anchor against Case 1 (competition spec §7.2): </w:t>
+      </w:r>
+      <w:r>
+        <w:t xml:space="preserve">“Shrinking Volume Game” gives signal mappings — CV~24ms → rs_interval_cv (machine/量化); iceberg split → rs_split_similarity; open/close &gt;70% → pi_open/close concentration (游资 rhythm); bid-sweeping → ap_unilateral_intensity. These figures come from the official spec narrative — ensure the spec is in docs/ so they're citeable. NOTE: the ~70% cancellation signal needs the cancel table (§4.2) — unavailable from snapshots alone.</w:t>
       </w:r>
     </w:p>
     <w:p>
@@ -3295,7 +3377,7 @@
         <w:t xml:space="preserve">Every pattern_type needs a 2–3 sentence pattern_explanation citing concrete intraday features </w:t>
       </w:r>
       <w:r>
-        <w:t xml:space="preserve">(“mega-order share 51%, active-buy 71%, open/close concentration 32% → hot-money pump”). Since scoring is on interpretability, the explanation IS a scored artifact — legitimate LLM-assist zone: generate from each cluster's feature centroid.</w:t>
+        <w:t xml:space="preserve">(illustrative only: “mega-order share ~51%, active-buy ~71%, open/close concentration ~32% → hot-money pump” — these figures are from the tutorial's example PROMPT, not ground truth; use each cluster's ACTUAL centroid values). Since scoring is on interpretability, the explanation IS a scored artifact — legitimate LLM-assist zone: generate from the centroid.</w:t>
       </w:r>
     </w:p>
     <w:p>
@@ -3436,10 +3518,10 @@
           <w:b/>
           <w:bCs/>
         </w:rPr>
-        <w:t xml:space="preserve">Case-anchored feature tests: </w:t>
-      </w:r>
-      <w:r>
-        <w:t xml:space="preserve">compute features on the 603997.SH / 20260507 fixture and assert they reproduce the Case 1 narrative numbers where applicable (cancellation ratio, interval CV, open/close concentration). This is our ONLY feature ground-truth — there is no reference table to diff against.</w:t>
+        <w:t xml:space="preserve">Feature tests — two kinds. </w:t>
+      </w:r>
+      <w:r>
+        <w:t xml:space="preserve">(1) Internal consistency (the reliable backbone): active_buy_pct + active_sell_pct ≈ 1; cumulative→diff increments are non-negative; hh buckets populate 8–16 not 0–8; OSS tier shares sum correctly. (2) Case-1 spec §7.2 directional sanity where computable on the fixture (interval CV low for machine rhythm, open/close concentration high). Note: the spec's specific figures (24ms, ~70% cancel) describe a DIFFERENT stock than our 603997.SH fixture, so treat them as directional expectations, not exact asserts on our one fixture.</w:t>
       </w:r>
     </w:p>
     <w:p>
@@ -4041,7 +4123,7 @@
               <w:t xml:space="preserve">Output guard: </w:t>
             </w:r>
             <w:r>
-              <w:t xml:space="preserve">main.py asserts transaction_date == expected yesterday-trading-day before writing, and re-checks label-value validity (§3) + UTF-8-sig encoding + no nulls/blank lines. An off-by-one date silently wastes the day.</w:t>
+              <w:t xml:space="preserve">main.py asserts transaction_date == expected yesterday-trading-day before writing, re-checks label-value validity (§3) + UTF-8-sig encoding + no nulls/blank lines, and packs submit.zip with the two CSVs at the ROOT (no nested folders — official format rule). An off-by-one date silently wastes the day.</w:t>
             </w:r>
           </w:p>
         </w:tc>
@@ -4550,6 +4632,68 @@
                 <w:sz w:val="19"/>
                 <w:szCs w:val="19"/>
               </w:rPr>
+              <w:t xml:space="preserve">submit.zip</w:t>
+            </w:r>
+          </w:p>
+        </w:tc>
+        <w:tc>
+          <w:tcPr>
+            <w:tcW w:type="dxa" w:w="6960"/>
+            <w:tcBorders>
+              <w:top w:val="single" w:color="CCCCCC" w:sz="1"/>
+              <w:left w:val="single" w:color="CCCCCC" w:sz="1"/>
+              <w:bottom w:val="single" w:color="CCCCCC" w:sz="1"/>
+              <w:right w:val="single" w:color="CCCCCC" w:sz="1"/>
+            </w:tcBorders>
+            <w:shd w:fill="FFFFFF" w:val="clear"/>
+            <w:tcMar>
+              <w:top w:type="dxa" w:w="60"/>
+              <w:left w:type="dxa" w:w="120"/>
+              <w:bottom w:type="dxa" w:w="60"/>
+              <w:right w:type="dxa" w:w="120"/>
+            </w:tcMar>
+          </w:tcPr>
+          <w:p>
+            <w:pPr>
+              <w:spacing w:after="20"/>
+            </w:pPr>
+            <w:r>
+              <w:rPr>
+                <w:sz w:val="19"/>
+                <w:szCs w:val="19"/>
+              </w:rPr>
+              <w:t xml:space="preserve">Both CSVs at the archive ROOT — no nested folders (official format rule).</w:t>
+            </w:r>
+          </w:p>
+        </w:tc>
+      </w:tr>
+      <w:tr>
+        <w:tc>
+          <w:tcPr>
+            <w:tcW w:type="dxa" w:w="2400"/>
+            <w:tcBorders>
+              <w:top w:val="single" w:color="CCCCCC" w:sz="1"/>
+              <w:left w:val="single" w:color="CCCCCC" w:sz="1"/>
+              <w:bottom w:val="single" w:color="CCCCCC" w:sz="1"/>
+              <w:right w:val="single" w:color="CCCCCC" w:sz="1"/>
+            </w:tcBorders>
+            <w:shd w:fill="F2F6FA" w:val="clear"/>
+            <w:tcMar>
+              <w:top w:type="dxa" w:w="60"/>
+              <w:left w:type="dxa" w:w="120"/>
+              <w:bottom w:type="dxa" w:w="60"/>
+              <w:right w:type="dxa" w:w="120"/>
+            </w:tcMar>
+          </w:tcPr>
+          <w:p>
+            <w:pPr>
+              <w:spacing w:after="20"/>
+            </w:pPr>
+            <w:r>
+              <w:rPr>
+                <w:sz w:val="19"/>
+                <w:szCs w:val="19"/>
+              </w:rPr>
               <w:t xml:space="preserve">Comments</w:t>
             </w:r>
           </w:p>
@@ -4563,7 +4707,7 @@
               <w:bottom w:val="single" w:color="CCCCCC" w:sz="1"/>
               <w:right w:val="single" w:color="CCCCCC" w:sz="1"/>
             </w:tcBorders>
-            <w:shd w:fill="FFFFFF" w:val="clear"/>
+            <w:shd w:fill="F2F6FA" w:val="clear"/>
             <w:tcMar>
               <w:top w:type="dxa" w:w="60"/>
               <w:left w:type="dxa" w:w="120"/>
@@ -5843,7 +5987,7 @@
         <w:spacing w:after="60" w:line="264"/>
       </w:pPr>
       <w:r>
-        <w:t xml:space="preserve">Implement the MVP feature set (§4.2), verify it reproduces the Case 1 narrative numbers, and bring results to the architect to convert §5 Stage-1 into exact per-feature thresholds.</w:t>
+        <w:t xml:space="preserve">Implement the MVP feature set (§4.3), verify internal-consistency tests pass + Case-1 (spec §7.2) directional sanity, and bring results to the architect to convert §5 Stage-1 into exact per-feature thresholds.</w:t>
       </w:r>
     </w:p>
     <w:p>

</xml_diff>

<commit_message>
feat: 3-class Task-2 capital_type + retail guard, tests, baseline reference
Invert Task 2 capital_type from the stale 2-class {游资, 量化机构} to the
organizer-confirmed 3-class {游资, 量化, 散户} (bare 量化). The DingTalk answer
overrides the baseline guide on both the count and the string.

- config: CAPITAL_TYPES now 3-class; FORBIDDEN_CAPITAL_TYPES = [量化机构]
- rules: 3-way scorer + guarded 散户 residual (rhythm-based, not size)
- label/model/postprocess: propagate 3-class scores + confidence margin
- tests: 3-way scorer + retail-guard gate-boundary cases (test_rules.py),
  updated test_config / test_postprocess
- docs: README to Rev. 7 / 3-class + repo layout; brief .docx Rev. 7
- docs/reference/official_baseline_main.py: frozen organizer baseline
  (2-class, stale) for diff/benchmark only - not wired into main.py

Co-Authored-By: Claude Opus 4.8 <noreply@anthropic.com>
</commit_message>
<xml_diff>
--- a/docs/AFAC2026_Track1_Project_Brief.docx
+++ b/docs/AFAC2026_Track1_Project_Brief.docx
@@ -58,14 +58,26 @@
       <w:pPr>
         <w:spacing w:before="80"/>
       </w:pPr>
-      <w:r>
-        <w:rPr>
-          <w:color w:val="C0392B"/>
-          <w:sz w:val="20"/>
-          <w:szCs w:val="20"/>
-        </w:rPr>
-        <w:t>Rev. 6 — verification follow-ups: Case 1 and logistics now cited to the in-repo spec (docs/competition-spec/); stale “add spec to repo” notes removed; market-phase (spec §5.3) folded into Task 2, not a third CSV; team size corrected to 1–3.</w:t>
-      </w:r>
+      <w:del w:id="9022" w:author="Claude" w:date="2026-06-14T00:00:00Z">
+        <w:r>
+          <w:rPr>
+            <w:color w:val="C0392B"/>
+            <w:sz w:val="20"/>
+            <w:szCs w:val="20"/>
+          </w:rPr>
+          <w:delText>Rev. 6 — verification follow-ups: Case 1 and logistics now cited to the in-repo spec (docs/competition-spec/); stale “add spec to repo” notes removed; market-phase (spec §5.3) folded into Task 2, not a third CSV; team size corrected to 1–3.</w:delText>
+        </w:r>
+      </w:del>
+      <w:ins w:id="9023" w:author="Claude" w:date="2026-06-14T00:00:00Z">
+        <w:r>
+          <w:rPr>
+            <w:color w:val="C0392B"/>
+            <w:sz w:val="20"/>
+            <w:szCs w:val="20"/>
+          </w:rPr>
+          <w:t xml:space="preserve">Rev. 7 — capital_type corrected from 2-class {游资,量化机构} to organizer-confirmed 3-class {游资,量化,散户}; bare 量化 is correct, 量化机构 now invalid, 散户 now a modelled residual class. Source: direct DingTalk organizer answer (overrides baseline guide).</w:t>
+        </w:r>
+      </w:ins>
     </w:p>
     <w:tbl>
       <w:tblPr>
@@ -1319,43 +1331,105 @@
       <w:pPr>
         <w:pStyle w:val="Heading2"/>
       </w:pPr>
-      <w:r>
-        <w:t xml:space="preserve">3.1 Task 2 — capital_type (2 classes — LOCKED)</w:t>
-      </w:r>
+      <w:del w:id="9001" w:author="Claude" w:date="2026-06-14T00:00:00Z">
+        <w:r>
+          <w:delText xml:space="preserve">3.1 Task 2 — capital_type (2 classes — LOCKED)</w:delText>
+        </w:r>
+      </w:del>
+      <w:ins w:id="9002" w:author="Claude" w:date="2026-06-14T00:00:00Z">
+        <w:r>
+          <w:t xml:space="preserve">3.1 Task 2 — capital_type (3 classes — LOCKED)</w:t>
+        </w:r>
+      </w:ins>
     </w:p>
     <w:p>
       <w:pPr>
         <w:spacing w:after="120" w:line="276"/>
       </w:pPr>
-      <w:r>
-        <w:rPr>
-          <w:b/>
-          <w:bCs/>
-        </w:rPr>
-        <w:t xml:space="preserve">Confirmed by the official baseline guide (stated 3×, incl. a validation assert </w:t>
-      </w:r>
-      <w:r>
-        <w:rPr>
-          <w:rFonts w:ascii="Consolas" w:cs="Consolas" w:eastAsia="Consolas" w:hAnsi="Consolas"/>
-          <w:sz w:val="20"/>
-          <w:szCs w:val="20"/>
-        </w:rPr>
-        <w:t xml:space="preserve">isin(['游资','量化机构'])</w:t>
-      </w:r>
-      <w:r>
-        <w:t xml:space="preserve">). Exactly two classes. The </w:t>
-      </w:r>
-      <w:r>
-        <w:rPr>
-          <w:rFonts w:ascii="Consolas" w:cs="Consolas" w:eastAsia="Consolas" w:hAnsi="Consolas"/>
-          <w:sz w:val="20"/>
-          <w:szCs w:val="20"/>
-        </w:rPr>
-        <w:t xml:space="preserve">散户</w:t>
-      </w:r>
-      <w:r>
-        <w:t xml:space="preserve"> value in the example file was a placeholder — do NOT model retail.</w:t>
-      </w:r>
+      <w:del w:id="9003" w:author="Claude" w:date="2026-06-14T00:00:00Z">
+        <w:r>
+          <w:rPr>
+            <w:b/>
+            <w:bCs/>
+          </w:rPr>
+          <w:delText xml:space="preserve">Confirmed by the official baseline guide (stated 3×, incl. a validation assert </w:delText>
+        </w:r>
+        <w:r>
+          <w:rPr>
+            <w:rFonts w:ascii="Consolas" w:cs="Consolas" w:eastAsia="Consolas" w:hAnsi="Consolas"/>
+            <w:sz w:val="20"/>
+            <w:szCs w:val="20"/>
+          </w:rPr>
+          <w:delText xml:space="preserve">isin(['游资','量化机构'])</w:delText>
+        </w:r>
+        <w:r>
+          <w:delText xml:space="preserve">). Exactly two classes. The </w:delText>
+        </w:r>
+        <w:r>
+          <w:rPr>
+            <w:rFonts w:ascii="Consolas" w:cs="Consolas" w:eastAsia="Consolas" w:hAnsi="Consolas"/>
+            <w:sz w:val="20"/>
+            <w:szCs w:val="20"/>
+          </w:rPr>
+          <w:delText xml:space="preserve">散户</w:delText>
+        </w:r>
+        <w:r>
+          <w:delText xml:space="preserve"> value in the example file was a placeholder — do NOT model retail.</w:delText>
+        </w:r>
+      </w:del>
+      <w:ins w:id="9004" w:author="Claude" w:date="2026-06-14T00:00:00Z">
+        <w:r>
+          <w:rPr>
+            <w:b/>
+            <w:bCs/>
+          </w:rPr>
+          <w:t xml:space="preserve">Confirmed by a direct organizer answer (DingTalk): capital_type has exactly three classes — </w:t>
+        </w:r>
+        <w:r>
+          <w:rPr>
+            <w:rFonts w:ascii="Consolas" w:cs="Consolas" w:eastAsia="Consolas" w:hAnsi="Consolas"/>
+            <w:sz w:val="20"/>
+            <w:szCs w:val="20"/>
+          </w:rPr>
+          <w:t xml:space="preserve">游资, 量化, 散户</w:t>
+        </w:r>
+        <w:r>
+          <w:t xml:space="preserve">. This overrides the official baseline guide, which was wrong on both the count (it said 2) and the quant string (it said </w:t>
+        </w:r>
+        <w:r>
+          <w:rPr>
+            <w:rFonts w:ascii="Consolas" w:cs="Consolas" w:eastAsia="Consolas" w:hAnsi="Consolas"/>
+            <w:sz w:val="20"/>
+            <w:szCs w:val="20"/>
+          </w:rPr>
+          <w:t xml:space="preserve">量化机构</w:t>
+        </w:r>
+        <w:r>
+          <w:t xml:space="preserve">; the correct value is the bare </w:t>
+        </w:r>
+        <w:r>
+          <w:rPr>
+            <w:rFonts w:ascii="Consolas" w:cs="Consolas" w:eastAsia="Consolas" w:hAnsi="Consolas"/>
+            <w:sz w:val="20"/>
+            <w:szCs w:val="20"/>
+          </w:rPr>
+          <w:t xml:space="preserve">量化</w:t>
+        </w:r>
+        <w:r>
+          <w:t xml:space="preserve">). </w:t>
+        </w:r>
+        <w:r>
+          <w:rPr>
+            <w:rFonts w:ascii="Consolas" w:cs="Consolas" w:eastAsia="Consolas" w:hAnsi="Consolas"/>
+            <w:sz w:val="20"/>
+            <w:szCs w:val="20"/>
+          </w:rPr>
+          <w:t xml:space="preserve">散户</w:t>
+        </w:r>
+        <w:r>
+          <w:t xml:space="preserve"> (retail) is now a real, modelled residual class — not a placeholder.</w:t>
+        </w:r>
+      </w:ins>
     </w:p>
     <w:tbl>
       <w:tblPr>
@@ -1583,13 +1657,24 @@
             <w:pPr>
               <w:spacing w:after="20"/>
             </w:pPr>
-            <w:r>
-              <w:rPr>
-                <w:sz w:val="19"/>
-                <w:szCs w:val="19"/>
-              </w:rPr>
-              <w:t xml:space="preserve">量化机构</w:t>
-            </w:r>
+            <w:del w:id="9005" w:author="Claude" w:date="2026-06-14T00:00:00Z">
+              <w:r>
+                <w:rPr>
+                  <w:sz w:val="19"/>
+                  <w:szCs w:val="19"/>
+                </w:rPr>
+                <w:delText xml:space="preserve">量化机构</w:delText>
+              </w:r>
+            </w:del>
+            <w:ins w:id="9006" w:author="Claude" w:date="2026-06-14T00:00:00Z">
+              <w:r>
+                <w:rPr>
+                  <w:sz w:val="19"/>
+                  <w:szCs w:val="19"/>
+                </w:rPr>
+                <w:t xml:space="preserve">量化</w:t>
+              </w:r>
+            </w:ins>
           </w:p>
         </w:tc>
         <w:tc>
@@ -1613,13 +1698,24 @@
             <w:pPr>
               <w:spacing w:after="20"/>
             </w:pPr>
-            <w:r>
-              <w:rPr>
-                <w:sz w:val="19"/>
-                <w:szCs w:val="19"/>
-              </w:rPr>
-              <w:t xml:space="preserve">Quantitative institution</w:t>
-            </w:r>
+            <w:del w:id="9007" w:author="Claude" w:date="2026-06-14T00:00:00Z">
+              <w:r>
+                <w:rPr>
+                  <w:sz w:val="19"/>
+                  <w:szCs w:val="19"/>
+                </w:rPr>
+                <w:delText xml:space="preserve">Quantitative institution</w:delText>
+              </w:r>
+            </w:del>
+            <w:ins w:id="9008" w:author="Claude" w:date="2026-06-14T00:00:00Z">
+              <w:r>
+                <w:rPr>
+                  <w:sz w:val="19"/>
+                  <w:szCs w:val="19"/>
+                </w:rPr>
+                <w:t xml:space="preserve">Quantitative (quant)</w:t>
+              </w:r>
+            </w:ins>
           </w:p>
         </w:tc>
         <w:tc>
@@ -1650,6 +1746,116 @@
               </w:rPr>
               <w:t xml:space="preserve">Small/frequent orders, balanced two-sided flow, low interval CV (machine rhythm), high burst ratio, high fast-cancel ratio (when cancel data present)</w:t>
             </w:r>
+          </w:p>
+        </w:tc>
+      </w:tr>
+      <w:tr>
+        <w:trPr>
+          <w:ins w:id="9009" w:author="Claude" w:date="2026-06-14T00:00:00Z"/>
+        </w:trPr>
+        <w:tc>
+          <w:tcPr>
+            <w:tcW w:type="dxa" w:w="2000"/>
+            <w:tcBorders>
+              <w:top w:val="single" w:color="CCCCCC" w:sz="1"/>
+              <w:left w:val="single" w:color="CCCCCC" w:sz="1"/>
+              <w:bottom w:val="single" w:color="CCCCCC" w:sz="1"/>
+              <w:right w:val="single" w:color="CCCCCC" w:sz="1"/>
+            </w:tcBorders>
+            <w:shd w:fill="FFFFFF" w:val="clear"/>
+            <w:tcMar>
+              <w:top w:type="dxa" w:w="60"/>
+              <w:left w:type="dxa" w:w="120"/>
+              <w:bottom w:type="dxa" w:w="60"/>
+              <w:right w:type="dxa" w:w="120"/>
+            </w:tcMar>
+          </w:tcPr>
+          <w:p>
+            <w:pPr>
+              <w:spacing w:after="20"/>
+              <w:rPr>
+                <w:ins w:id="9010" w:author="Claude" w:date="2026-06-14T00:00:00Z"/>
+              </w:rPr>
+            </w:pPr>
+            <w:ins w:id="9011" w:author="Claude" w:date="2026-06-14T00:00:00Z">
+              <w:r>
+                <w:rPr>
+                  <w:sz w:val="19"/>
+                  <w:szCs w:val="19"/>
+                </w:rPr>
+                <w:t xml:space="preserve">散户</w:t>
+              </w:r>
+            </w:ins>
+          </w:p>
+        </w:tc>
+        <w:tc>
+          <w:tcPr>
+            <w:tcW w:type="dxa" w:w="2400"/>
+            <w:tcBorders>
+              <w:top w:val="single" w:color="CCCCCC" w:sz="1"/>
+              <w:left w:val="single" w:color="CCCCCC" w:sz="1"/>
+              <w:bottom w:val="single" w:color="CCCCCC" w:sz="1"/>
+              <w:right w:val="single" w:color="CCCCCC" w:sz="1"/>
+            </w:tcBorders>
+            <w:shd w:fill="FFFFFF" w:val="clear"/>
+            <w:tcMar>
+              <w:top w:type="dxa" w:w="60"/>
+              <w:left w:type="dxa" w:w="120"/>
+              <w:bottom w:type="dxa" w:w="60"/>
+              <w:right w:type="dxa" w:w="120"/>
+            </w:tcMar>
+          </w:tcPr>
+          <w:p>
+            <w:pPr>
+              <w:spacing w:after="20"/>
+              <w:rPr>
+                <w:ins w:id="9012" w:author="Claude" w:date="2026-06-14T00:00:00Z"/>
+              </w:rPr>
+            </w:pPr>
+            <w:ins w:id="9013" w:author="Claude" w:date="2026-06-14T00:00:00Z">
+              <w:r>
+                <w:rPr>
+                  <w:sz w:val="19"/>
+                  <w:szCs w:val="19"/>
+                </w:rPr>
+                <w:t xml:space="preserve">Retail</w:t>
+              </w:r>
+            </w:ins>
+          </w:p>
+        </w:tc>
+        <w:tc>
+          <w:tcPr>
+            <w:tcW w:type="dxa" w:w="4960"/>
+            <w:tcBorders>
+              <w:top w:val="single" w:color="CCCCCC" w:sz="1"/>
+              <w:left w:val="single" w:color="CCCCCC" w:sz="1"/>
+              <w:bottom w:val="single" w:color="CCCCCC" w:sz="1"/>
+              <w:right w:val="single" w:color="CCCCCC" w:sz="1"/>
+            </w:tcBorders>
+            <w:shd w:fill="FFFFFF" w:val="clear"/>
+            <w:tcMar>
+              <w:top w:type="dxa" w:w="60"/>
+              <w:left w:type="dxa" w:w="120"/>
+              <w:bottom w:type="dxa" w:w="60"/>
+              <w:right w:type="dxa" w:w="120"/>
+            </w:tcMar>
+          </w:tcPr>
+          <w:p>
+            <w:pPr>
+              <w:spacing w:after="20"/>
+              <w:rPr>
+                <w:ins w:id="9014" w:author="Claude" w:date="2026-06-14T00:00:00Z"/>
+              </w:rPr>
+            </w:pPr>
+            <w:ins w:id="9015" w:author="Claude" w:date="2026-06-14T00:00:00Z">
+              <w:r>
+                <w:rPr>
+                  <w:sz w:val="19"/>
+                  <w:szCs w:val="19"/>
+                </w:rPr>
+                <w:t xml:space="preserve">Small orders, low one-sided aggression, diffuse timing (no open/close concentration), no machine rhythm — separated from 量化 by execution rhythm, not order size (guarded residual)</w:t>
+              </w:r>
+            </w:ins>
           </w:p>
         </w:tc>
       </w:tr>
@@ -1658,35 +1864,68 @@
       <w:pPr>
         <w:spacing w:after="120" w:line="276"/>
       </w:pPr>
-      <w:r>
-        <w:rPr>
-          <w:b/>
-          <w:bCs/>
-        </w:rPr>
-        <w:t xml:space="preserve">Note the exact string is </w:t>
-      </w:r>
-      <w:r>
-        <w:rPr>
-          <w:rFonts w:ascii="Consolas" w:cs="Consolas" w:eastAsia="Consolas" w:hAnsi="Consolas"/>
-          <w:sz w:val="20"/>
-          <w:szCs w:val="20"/>
-        </w:rPr>
-        <w:t xml:space="preserve">量化机构</w:t>
-      </w:r>
-      <w:r>
-        <w:t xml:space="preserve">, not </w:t>
-      </w:r>
-      <w:r>
-        <w:rPr>
-          <w:rFonts w:ascii="Consolas" w:cs="Consolas" w:eastAsia="Consolas" w:hAnsi="Consolas"/>
-          <w:sz w:val="20"/>
-          <w:szCs w:val="20"/>
-        </w:rPr>
-        <w:t xml:space="preserve">量化</w:t>
-      </w:r>
-      <w:r>
-        <w:t xml:space="preserve"> alone — the assert checks the full two characters + 机构.</w:t>
-      </w:r>
+      <w:del w:id="9016" w:author="Claude" w:date="2026-06-14T00:00:00Z">
+        <w:r>
+          <w:rPr>
+            <w:b/>
+            <w:bCs/>
+          </w:rPr>
+          <w:delText xml:space="preserve">Note the exact string is </w:delText>
+        </w:r>
+        <w:r>
+          <w:rPr>
+            <w:rFonts w:ascii="Consolas" w:cs="Consolas" w:eastAsia="Consolas" w:hAnsi="Consolas"/>
+            <w:sz w:val="20"/>
+            <w:szCs w:val="20"/>
+          </w:rPr>
+          <w:delText xml:space="preserve">量化机构</w:delText>
+        </w:r>
+        <w:r>
+          <w:delText xml:space="preserve">, not </w:delText>
+        </w:r>
+        <w:r>
+          <w:rPr>
+            <w:rFonts w:ascii="Consolas" w:cs="Consolas" w:eastAsia="Consolas" w:hAnsi="Consolas"/>
+            <w:sz w:val="20"/>
+            <w:szCs w:val="20"/>
+          </w:rPr>
+          <w:delText xml:space="preserve">量化</w:delText>
+        </w:r>
+        <w:r>
+          <w:delText xml:space="preserve"> alone — the assert checks the full two characters + 机构.</w:delText>
+        </w:r>
+      </w:del>
+      <w:ins w:id="9017" w:author="Claude" w:date="2026-06-14T00:00:00Z">
+        <w:r>
+          <w:rPr>
+            <w:b/>
+            <w:bCs/>
+          </w:rPr>
+          <w:t xml:space="preserve">Note the exact quant string is the bare </w:t>
+        </w:r>
+        <w:r>
+          <w:rPr>
+            <w:rFonts w:ascii="Consolas" w:cs="Consolas" w:eastAsia="Consolas" w:hAnsi="Consolas"/>
+            <w:sz w:val="20"/>
+            <w:szCs w:val="20"/>
+          </w:rPr>
+          <w:t xml:space="preserve">量化</w:t>
+        </w:r>
+        <w:r>
+          <w:t xml:space="preserve">, not </w:t>
+        </w:r>
+        <w:r>
+          <w:rPr>
+            <w:rFonts w:ascii="Consolas" w:cs="Consolas" w:eastAsia="Consolas" w:hAnsi="Consolas"/>
+            <w:sz w:val="20"/>
+            <w:szCs w:val="20"/>
+          </w:rPr>
+          <w:t xml:space="preserve">量化机构</w:t>
+        </w:r>
+        <w:r>
+          <w:t xml:space="preserve"> — the organizer confirmed the two-character form; the old 量化机构 (the 2-class string) is now invalid.</w:t>
+        </w:r>
+      </w:ins>
     </w:p>
     <w:p>
       <w:pPr>
@@ -2358,15 +2597,28 @@
         <w:br/>
         <w:t xml:space="preserve">     ├─ window aggregation → daily (symbol,dt) vector   # group by dt (calendar day), hh for intraday buckets</w:t>
       </w:r>
-      <w:r>
-        <w:rPr>
-          <w:rFonts w:ascii="Consolas" w:cs="Consolas" w:eastAsia="Consolas" w:hAnsi="Consolas"/>
-          <w:sz w:val="19"/>
-          <w:szCs w:val="19"/>
-        </w:rPr>
-        <w:br/>
-        <w:t xml:space="preserve">     ├─ Task2 head 1: capital_type   ∈ {游资, 量化机构}        + confidence   # 2 classes (LOCKED)</w:t>
-      </w:r>
+      <w:del w:id="9018" w:author="Claude" w:date="2026-06-14T00:00:00Z">
+        <w:r>
+          <w:rPr>
+            <w:rFonts w:ascii="Consolas" w:cs="Consolas" w:eastAsia="Consolas" w:hAnsi="Consolas"/>
+            <w:sz w:val="19"/>
+            <w:szCs w:val="19"/>
+          </w:rPr>
+          <w:br/>
+          <w:delText xml:space="preserve">     ├─ Task2 head 1: capital_type   ∈ {游资, 量化机构}        + confidence   # 2 classes (LOCKED)</w:delText>
+        </w:r>
+      </w:del>
+      <w:ins w:id="9019" w:author="Claude" w:date="2026-06-14T00:00:00Z">
+        <w:r>
+          <w:rPr>
+            <w:rFonts w:ascii="Consolas" w:cs="Consolas" w:eastAsia="Consolas" w:hAnsi="Consolas"/>
+            <w:sz w:val="19"/>
+            <w:szCs w:val="19"/>
+          </w:rPr>
+          <w:br/>
+          <w:t xml:space="preserve">     ├─ Task2 head 1: capital_type   ∈ {游资, 量化, 散户}        + confidence   # 3 classes (LOCKED)</w:t>
+        </w:r>
+      </w:ins>
       <w:r>
         <w:rPr>
           <w:rFonts w:ascii="Consolas" w:cs="Consolas" w:eastAsia="Consolas" w:hAnsi="Consolas"/>
@@ -2963,9 +3215,16 @@
         </w:numPr>
         <w:spacing w:after="60" w:line="264"/>
       </w:pPr>
-      <w:r>
-        <w:t xml:space="preserve">Per (stock, day), z-score / rank-normalize the discriminating features, then compute a continuous 游资-vs-量化机构 score (the 11-dim weighted scoring the baseline uses) and a separate direction/T0 score from the §3.2 gate.</w:t>
-      </w:r>
+      <w:del w:id="9024" w:author="Claude" w:date="2026-06-14T00:00:00Z">
+        <w:r>
+          <w:delText xml:space="preserve">Per (stock, day), z-score / rank-normalize the discriminating features, then compute a continuous 游资-vs-量化机构 score (the 11-dim weighted scoring the baseline uses) and a separate direction/T0 score from the §3.2 gate.</w:delText>
+        </w:r>
+      </w:del>
+      <w:ins w:id="9025" w:author="Claude" w:date="2026-06-14T00:00:00Z">
+        <w:r>
+          <w:t xml:space="preserve">Per (stock, day), z-score / rank-normalize the discriminating features, then compute three continuous 游资 / 量化 / 散户 scores (the z-scored dimension routing; 散户 is a guarded residual) and a separate direction/T0 score from the §3.2 gate.</w:t>
+        </w:r>
+      </w:ins>
     </w:p>
     <w:p>
       <w:pPr>
@@ -2976,9 +3235,16 @@
         </w:numPr>
         <w:spacing w:after="60" w:line="264"/>
       </w:pPr>
-      <w:r>
-        <w:t xml:space="preserve">Output continuous scores, not hard labels. Fully feature-driven → survives the hard-coding ban. Official framing: 游资 = large/active/imbalanced; 量化机构 = small/frequent/balanced.</w:t>
-      </w:r>
+      <w:del w:id="9026" w:author="Claude" w:date="2026-06-14T00:00:00Z">
+        <w:r>
+          <w:delText xml:space="preserve">Output continuous scores, not hard labels. Fully feature-driven → survives the hard-coding ban. Official framing: 游资 = large/active/imbalanced; 量化机构 = small/frequent/balanced.</w:delText>
+        </w:r>
+      </w:del>
+      <w:ins w:id="9027" w:author="Claude" w:date="2026-06-14T00:00:00Z">
+        <w:r>
+          <w:t xml:space="preserve">Output continuous scores, not hard labels. Fully feature-driven → survives the hard-coding ban. Official framing: 游资 = large/active/imbalanced; 量化 = small/frequent/balanced (machine rhythm); 散户 = small but no cadence, low aggression (residual).</w:t>
+        </w:r>
+      </w:ins>
     </w:p>
     <w:p>
       <w:pPr>
@@ -3051,9 +3317,16 @@
         </w:numPr>
         <w:spacing w:after="60" w:line="264"/>
       </w:pPr>
-      <w:r>
-        <w:t xml:space="preserve">Train LightGBM / XGBoost on the Stage-2 weak labels: one BINARY head for capital_type (游资 vs 量化机构) and one 3-class head for capital_intention (买入/卖出/T0交易). This is Path 3 in the official tutorial.</w:t>
-      </w:r>
+      <w:del w:id="9020" w:author="Claude" w:date="2026-06-14T00:00:00Z">
+        <w:r>
+          <w:delText xml:space="preserve">Train LightGBM / XGBoost on the Stage-2 weak labels: one BINARY head for capital_type (游资 vs 量化机构) and one 3-class head for capital_intention (买入/卖出/T0交易). This is Path 3 in the official tutorial.</w:delText>
+        </w:r>
+      </w:del>
+      <w:ins w:id="9021" w:author="Claude" w:date="2026-06-14T00:00:00Z">
+        <w:r>
+          <w:t xml:space="preserve">Train LightGBM / XGBoost on the Stage-2 weak labels: one 3-class head for capital_type (游资/量化/散户) and one 3-class head for capital_intention (买入/卖出/T0交易). This is Path 3 in the official tutorial.</w:t>
+        </w:r>
+      </w:ins>
     </w:p>
     <w:p>
       <w:pPr>

</xml_diff>